<commit_message>
Agreements: right-to-left in the artifact preview; cancellation of credit purchases and trips
The preview skeleton has no dir on <html>, so set RTL on body, the sheet and the bar.
Add 4.3 (a used credit is not refunded, even if the trip is cancelled after
publishing) and 4.4 (cancel a credit package within 14 days for a full refund
if no credit was used); update the cross-reference to 4.5 and the summary.

Co-Authored-By: Claude Opus 5.5 <noreply@anthropic.com>
Claude-Session: https://claude.ai/code/session_011hQYizVFFk5W4ZviYoXYBE
</commit_message>
<xml_diff>
--- a/docs/legal/agreements/out/palami-agreement-agency-legal-review.docx
+++ b/docs/legal/agreements/out/palami-agreement-agency-legal-review.docx
@@ -1114,7 +1114,7 @@
                 <w:rtl/>
                 <w:lang w:val="he-IL" w:bidi="he-IL"/>
               </w:rPr>
-              <w:t xml:space="preserve">משלמים רק על מה שנשלח. קרדיט נצרך פעם אחת לנסיעה, בפרסום הראשון.</w:t>
+              <w:t xml:space="preserve">משלמים רק על מה שנשלח. קרדיט נצרך פעם אחת לנסיעה, בפרסום הראשון. חבילה שלא השתמשו בה אפשר לבטל תוך 14 יום.</w:t>
             </w:r>
           </w:p>
           <w:p>
@@ -2106,7 +2106,7 @@
           <w:rtl/>
           <w:lang w:val="he-IL" w:bidi="he-IL"/>
         </w:rPr>
-        <w:t xml:space="preserve">שינוי מחיר יימסר באימייל 30 יום מראש לפחות, ויחול רק על רכישות שאחרי מועד השינוי. קרדיטים שכבר נרכשו שומרים על ערכם עד תום תוקפם. מי שלא מסכים לשינוי רשאי לסיים את ההסכם לפני שהוא חל, לפי סעיף 10.5.</w:t>
+        <w:t xml:space="preserve">קרדיט שנוצל לא מוחזר, גם אם הנסיעה בוטלה אחרי הפרסום. במקרה כזה הנוסעים רואים שהנסיעה בוטלה ואת פרטי הקשר של הסוכנות, והקישור שלהם נסגר 7 ימים אחרי הביטול.</w:t>
       </w:r>
     </w:p>
     <w:p>
@@ -2129,6 +2129,90 @@
           <w:lang w:val="he-IL" w:bidi="he-IL"/>
         </w:rPr>
         <w:t xml:space="preserve">4.4</w:t>
+      </w:r>
+      <w:r>
+        <w:rPr>
+          <w:rFonts w:ascii="Arial" w:cs="Arial" w:hAnsi="Arial"/>
+          <w:sz w:val="21"/>
+          <w:szCs w:val="21"/>
+          <w:rtl/>
+          <w:lang w:val="he-IL" w:bidi="he-IL"/>
+        </w:rPr>
+        <w:t xml:space="preserve">	</w:t>
+      </w:r>
+      <w:r>
+        <w:rPr>
+          <w:rFonts w:ascii="Arial" w:cs="Arial" w:hAnsi="Arial"/>
+          <w:sz w:val="21"/>
+          <w:szCs w:val="21"/>
+          <w:rtl/>
+          <w:lang w:val="he-IL" w:bidi="he-IL"/>
+        </w:rPr>
+        <w:t xml:space="preserve">ביטול רכישה: אפשר לבטל רכישה של חבילת קרדיטים תוך 14 יום מיום הרכישה, בהודעה באימייל, ולקבל החזר מלא, כל עוד לא נוצל ממנה אף קרדיט.</w:t>
+      </w:r>
+    </w:p>
+    <w:p>
+      <w:pPr>
+        <w:tabs>
+          <w:tab w:val="left" w:pos="680"/>
+        </w:tabs>
+        <w:bidi/>
+        <w:spacing w:after="100" w:before="0" w:line="300"/>
+        <w:ind w:left="680" w:hanging="680"/>
+        <w:jc w:val="both"/>
+      </w:pPr>
+      <w:r>
+        <w:rPr>
+          <w:rFonts w:ascii="Arial" w:cs="Arial" w:hAnsi="Arial"/>
+          <w:color w:val="545D58"/>
+          <w:sz w:val="19"/>
+          <w:szCs w:val="19"/>
+          <w:rtl/>
+          <w:lang w:val="he-IL" w:bidi="he-IL"/>
+        </w:rPr>
+        <w:t xml:space="preserve">4.5</w:t>
+      </w:r>
+      <w:r>
+        <w:rPr>
+          <w:rFonts w:ascii="Arial" w:cs="Arial" w:hAnsi="Arial"/>
+          <w:sz w:val="21"/>
+          <w:szCs w:val="21"/>
+          <w:rtl/>
+          <w:lang w:val="he-IL" w:bidi="he-IL"/>
+        </w:rPr>
+        <w:t xml:space="preserve">	</w:t>
+      </w:r>
+      <w:r>
+        <w:rPr>
+          <w:rFonts w:ascii="Arial" w:cs="Arial" w:hAnsi="Arial"/>
+          <w:sz w:val="21"/>
+          <w:szCs w:val="21"/>
+          <w:rtl/>
+          <w:lang w:val="he-IL" w:bidi="he-IL"/>
+        </w:rPr>
+        <w:t xml:space="preserve">שינוי מחיר יימסר באימייל 30 יום מראש לפחות, ויחול רק על רכישות שאחרי מועד השינוי. קרדיטים שכבר נרכשו שומרים על ערכם עד תום תוקפם. מי שלא מסכים לשינוי רשאי לסיים את ההסכם לפני שהוא חל, לפי סעיף 10.5.</w:t>
+      </w:r>
+    </w:p>
+    <w:p>
+      <w:pPr>
+        <w:tabs>
+          <w:tab w:val="left" w:pos="680"/>
+        </w:tabs>
+        <w:bidi/>
+        <w:spacing w:after="100" w:before="0" w:line="300"/>
+        <w:ind w:left="680" w:hanging="680"/>
+        <w:jc w:val="both"/>
+      </w:pPr>
+      <w:r>
+        <w:rPr>
+          <w:rFonts w:ascii="Arial" w:cs="Arial" w:hAnsi="Arial"/>
+          <w:color w:val="545D58"/>
+          <w:sz w:val="19"/>
+          <w:szCs w:val="19"/>
+          <w:rtl/>
+          <w:lang w:val="he-IL" w:bidi="he-IL"/>
+        </w:rPr>
+        <w:t xml:space="preserve">4.6</w:t>
       </w:r>
       <w:r>
         <w:rPr>
@@ -3354,7 +3438,7 @@
           <w:rtl/>
           <w:lang w:val="he-IL" w:bidi="he-IL"/>
         </w:rPr>
-        <w:t xml:space="preserve">אם PALAMI מסיימת את ההסכם שלא בגלל הפרה של הסוכנות או מפסיקה את השירות, או אם הסוכנות מסיימת אותו בגלל שינוי לפי סעיפים 4.3, 5.4 או 11, PALAMI תחזיר את החלק היחסי ששולם על קרדיטים שלא נוצלו ועל דמי מנוי ששולמו מראש.</w:t>
+        <w:t xml:space="preserve">אם PALAMI מסיימת את ההסכם שלא בגלל הפרה של הסוכנות או מפסיקה את השירות, או אם הסוכנות מסיימת אותו בגלל שינוי לפי סעיפים 4.5, 5.4 או 11, PALAMI תחזיר את החלק היחסי ששולם על קרדיטים שלא נוצלו ועל דמי מנוי ששולמו מראש.</w:t>
       </w:r>
     </w:p>
     <w:p>

</xml_diff>